<commit_message>
Every cited table is now in the submitted document
An audit of what the prose cites against what make_tables.py renders found a
defect in both papers, and a worse one in Paper 2: twelve of the thirty tables
it cites - the cost models, the risk relativities, the full ruin grid, the
wave-4 comparison, the poverty-line sensitivity, the Tweedie profile and
others - were computed and written to output/tables but never rendered into
the manuscript. A reader of the submitted PDF was being pointed at tables that
were not in it. All twelve are now rendered.

Paper 3 had the mirror problem on a smaller scale: four tables rendered and
never referred to. Now cited where they belong.

check_manuscript.py gains a cross_reference() pass that fails the build on
either mismatch, so neither can recur. Both papers now balance exactly -
Paper 2 at 30 tables, Paper 3 at 13.
</commit_message>
<xml_diff>
--- a/manuscript/Paper3_Babalola.docx
+++ b/manuscript/Paper3_Babalola.docx
@@ -1160,7 +1160,7 @@
         <w:pStyle w:val="BodyText"/>
       </w:pPr>
       <w:r>
-        <w:t xml:space="preserve">Nothing here is surprising, and this is the comparison the literature already supports. It is also, we will argue, the least informative comparison available.</w:t>
+        <w:t xml:space="preserve">Table 1b breaks both countries down by subgroup. Nothing here is surprising, and this is the comparison the literature already supports. It is also, we will argue, the least informative comparison available.</w:t>
       </w:r>
     </w:p>
     <w:bookmarkEnd w:id="24"/>
@@ -1686,7 +1686,7 @@
         <w:pStyle w:val="BodyText"/>
       </w:pPr>
       <w:r>
-        <w:t xml:space="preserve">The estimates are stable where it matters. Across thresholds at the 85th, 90th and 95th percentiles the US shape moves between 0.60 and 0.80 and never approaches the Nigerian range; the Nigerian shape hovers around zero and turns more negative at higher thresholds, which is what a bounded tail looks like.</w:t>
+        <w:t xml:space="preserve">The estimates are stable where it matters. Across thresholds at the 85th, 90th and 95th percentiles (Table A2) the US shape moves between 0.60 and 0.80 and never approaches the Nigerian range; the Nigerian shape hovers around zero and turns more negative at higher thresholds, which is what a bounded tail looks like.</w:t>
       </w:r>
     </w:p>
     <w:p>
@@ -1969,7 +1969,7 @@
         <w:pStyle w:val="BodyText"/>
       </w:pPr>
       <w:r>
-        <w:t xml:space="preserve">The crossover analysis locates the same result differently. All US families overtake Nigeria’s informal sector at the 99.5th percentile of their own distribution. Families with an elderly member cross at the 99th.</w:t>
+        <w:t xml:space="preserve">The crossover analysis (Table 5) locates the same result differently. All US families overtake Nigeria’s informal sector at the 99.5th percentile of their own distribution. Families with an elderly member cross at the 99th.</w:t>
       </w:r>
       <w:r>
         <w:t xml:space="preserve"> </w:t>
@@ -2068,7 +2068,7 @@
         <w:pStyle w:val="FirstParagraph"/>
       </w:pPr>
       <w:r>
-        <w:t xml:space="preserve">Grouping by insurance status gives a result that looks wrong until the mechanism is clear. Families insured all year have a</w:t>
+        <w:t xml:space="preserve">Table 6 gives the burden quantiles for every group in both countries. Grouping by insurance status gives a result that looks wrong until the mechanism is clear. Families insured all year have a</w:t>
       </w:r>
       <w:r>
         <w:t xml:space="preserve"> </w:t>

</xml_diff>